<commit_message>
Fix table column widths; strengthen novelty + safety framing
</commit_message>
<xml_diff>
--- a/final_manuscript/PICUP-FDD_manuscript_PSEP.docx
+++ b/final_manuscript/PICUP-FDD_manuscript_PSEP.docx
@@ -4542,16 +4542,17 @@
     <w:tbl>
       <w:tblPr>
         <w:tblStyle w:val="Table"/>
-        <w:tblW w:type="pct" w:w="5000.0"/>
+        <w:tblW w:type="dxa" w:w="9360"/>
         <w:tblLook w:firstRow="1"/>
+        <w:tblLayout w:type="fixed"/>
       </w:tblPr>
       <w:tblGrid>
-        <w:gridCol w:w="609"/>
-        <w:gridCol w:w="1827"/>
-        <w:gridCol w:w="1218"/>
-        <w:gridCol w:w="1827"/>
-        <w:gridCol w:w="1218"/>
-        <w:gridCol w:w="1218"/>
+        <w:gridCol w:w="1560"/>
+        <w:gridCol w:w="1560"/>
+        <w:gridCol w:w="1560"/>
+        <w:gridCol w:w="1560"/>
+        <w:gridCol w:w="1560"/>
+        <w:gridCol w:w="1560"/>
       </w:tblGrid>
       <w:tr>
         <w:trPr>
@@ -4559,6 +4560,7 @@
         </w:trPr>
         <w:tc>
           <w:tcPr>
+            <w:tcW w:type="dxa" w:w="1560"/>
             <w:tcBorders>
               <w:bottom w:val="single"/>
             </w:tcBorders>
@@ -4576,6 +4578,7 @@
         </w:tc>
         <w:tc>
           <w:tcPr>
+            <w:tcW w:type="dxa" w:w="1560"/>
             <w:tcBorders>
               <w:bottom w:val="single"/>
             </w:tcBorders>
@@ -4593,6 +4596,7 @@
         </w:tc>
         <w:tc>
           <w:tcPr>
+            <w:tcW w:type="dxa" w:w="1560"/>
             <w:tcBorders>
               <w:bottom w:val="single"/>
             </w:tcBorders>
@@ -4610,6 +4614,7 @@
         </w:tc>
         <w:tc>
           <w:tcPr>
+            <w:tcW w:type="dxa" w:w="1560"/>
             <w:tcBorders>
               <w:bottom w:val="single"/>
             </w:tcBorders>
@@ -4627,6 +4632,7 @@
         </w:tc>
         <w:tc>
           <w:tcPr>
+            <w:tcW w:type="dxa" w:w="1560"/>
             <w:tcBorders>
               <w:bottom w:val="single"/>
             </w:tcBorders>
@@ -4644,6 +4650,7 @@
         </w:tc>
         <w:tc>
           <w:tcPr>
+            <w:tcW w:type="dxa" w:w="1560"/>
             <w:tcBorders>
               <w:bottom w:val="single"/>
             </w:tcBorders>
@@ -4662,6 +4669,9 @@
       </w:tr>
       <w:tr>
         <w:tc>
+          <w:tcPr>
+            <w:tcW w:type="dxa" w:w="1560"/>
+          </w:tcPr>
           <w:p>
             <w:pPr>
               <w:pStyle w:val="Compact"/>
@@ -4673,6 +4683,9 @@
           </w:p>
         </w:tc>
         <w:tc>
+          <w:tcPr>
+            <w:tcW w:type="dxa" w:w="1560"/>
+          </w:tcPr>
           <w:p>
             <w:pPr>
               <w:pStyle w:val="Compact"/>
@@ -4684,6 +4697,9 @@
           </w:p>
         </w:tc>
         <w:tc>
+          <w:tcPr>
+            <w:tcW w:type="dxa" w:w="1560"/>
+          </w:tcPr>
           <w:p>
             <w:pPr>
               <w:pStyle w:val="Compact"/>
@@ -4695,6 +4711,9 @@
           </w:p>
         </w:tc>
         <w:tc>
+          <w:tcPr>
+            <w:tcW w:type="dxa" w:w="1560"/>
+          </w:tcPr>
           <w:p>
             <w:pPr>
               <w:pStyle w:val="Compact"/>
@@ -4706,6 +4725,9 @@
           </w:p>
         </w:tc>
         <w:tc>
+          <w:tcPr>
+            <w:tcW w:type="dxa" w:w="1560"/>
+          </w:tcPr>
           <w:p>
             <w:pPr>
               <w:pStyle w:val="Compact"/>
@@ -4717,6 +4739,9 @@
           </w:p>
         </w:tc>
         <w:tc>
+          <w:tcPr>
+            <w:tcW w:type="dxa" w:w="1560"/>
+          </w:tcPr>
           <w:p>
             <w:pPr>
               <w:pStyle w:val="Compact"/>
@@ -4730,6 +4755,9 @@
       </w:tr>
       <w:tr>
         <w:tc>
+          <w:tcPr>
+            <w:tcW w:type="dxa" w:w="1560"/>
+          </w:tcPr>
           <w:p>
             <w:pPr>
               <w:pStyle w:val="Compact"/>
@@ -4741,6 +4769,9 @@
           </w:p>
         </w:tc>
         <w:tc>
+          <w:tcPr>
+            <w:tcW w:type="dxa" w:w="1560"/>
+          </w:tcPr>
           <w:p>
             <w:pPr>
               <w:pStyle w:val="Compact"/>
@@ -4752,6 +4783,9 @@
           </w:p>
         </w:tc>
         <w:tc>
+          <w:tcPr>
+            <w:tcW w:type="dxa" w:w="1560"/>
+          </w:tcPr>
           <w:p>
             <w:pPr>
               <w:pStyle w:val="Compact"/>
@@ -4763,6 +4797,9 @@
           </w:p>
         </w:tc>
         <w:tc>
+          <w:tcPr>
+            <w:tcW w:type="dxa" w:w="1560"/>
+          </w:tcPr>
           <w:p>
             <w:pPr>
               <w:pStyle w:val="Compact"/>
@@ -4774,6 +4811,9 @@
           </w:p>
         </w:tc>
         <w:tc>
+          <w:tcPr>
+            <w:tcW w:type="dxa" w:w="1560"/>
+          </w:tcPr>
           <w:p>
             <w:pPr>
               <w:pStyle w:val="Compact"/>
@@ -4785,6 +4825,9 @@
           </w:p>
         </w:tc>
         <w:tc>
+          <w:tcPr>
+            <w:tcW w:type="dxa" w:w="1560"/>
+          </w:tcPr>
           <w:p>
             <w:pPr>
               <w:pStyle w:val="Compact"/>
@@ -4798,6 +4841,9 @@
       </w:tr>
       <w:tr>
         <w:tc>
+          <w:tcPr>
+            <w:tcW w:type="dxa" w:w="1560"/>
+          </w:tcPr>
           <w:p>
             <w:pPr>
               <w:pStyle w:val="Compact"/>
@@ -4809,6 +4855,9 @@
           </w:p>
         </w:tc>
         <w:tc>
+          <w:tcPr>
+            <w:tcW w:type="dxa" w:w="1560"/>
+          </w:tcPr>
           <w:p>
             <w:pPr>
               <w:pStyle w:val="Compact"/>
@@ -4820,6 +4869,9 @@
           </w:p>
         </w:tc>
         <w:tc>
+          <w:tcPr>
+            <w:tcW w:type="dxa" w:w="1560"/>
+          </w:tcPr>
           <w:p>
             <w:pPr>
               <w:pStyle w:val="Compact"/>
@@ -4831,6 +4883,9 @@
           </w:p>
         </w:tc>
         <w:tc>
+          <w:tcPr>
+            <w:tcW w:type="dxa" w:w="1560"/>
+          </w:tcPr>
           <w:p>
             <w:pPr>
               <w:pStyle w:val="Compact"/>
@@ -4842,6 +4897,9 @@
           </w:p>
         </w:tc>
         <w:tc>
+          <w:tcPr>
+            <w:tcW w:type="dxa" w:w="1560"/>
+          </w:tcPr>
           <w:p>
             <w:pPr>
               <w:pStyle w:val="Compact"/>
@@ -4853,6 +4911,9 @@
           </w:p>
         </w:tc>
         <w:tc>
+          <w:tcPr>
+            <w:tcW w:type="dxa" w:w="1560"/>
+          </w:tcPr>
           <w:p>
             <w:pPr>
               <w:pStyle w:val="Compact"/>
@@ -4866,6 +4927,9 @@
       </w:tr>
       <w:tr>
         <w:tc>
+          <w:tcPr>
+            <w:tcW w:type="dxa" w:w="1560"/>
+          </w:tcPr>
           <w:p>
             <w:pPr>
               <w:pStyle w:val="Compact"/>
@@ -4877,6 +4941,9 @@
           </w:p>
         </w:tc>
         <w:tc>
+          <w:tcPr>
+            <w:tcW w:type="dxa" w:w="1560"/>
+          </w:tcPr>
           <w:p>
             <w:pPr>
               <w:pStyle w:val="Compact"/>
@@ -4888,6 +4955,9 @@
           </w:p>
         </w:tc>
         <w:tc>
+          <w:tcPr>
+            <w:tcW w:type="dxa" w:w="1560"/>
+          </w:tcPr>
           <w:p>
             <w:pPr>
               <w:pStyle w:val="Compact"/>
@@ -4899,6 +4969,9 @@
           </w:p>
         </w:tc>
         <w:tc>
+          <w:tcPr>
+            <w:tcW w:type="dxa" w:w="1560"/>
+          </w:tcPr>
           <w:p>
             <w:pPr>
               <w:pStyle w:val="Compact"/>
@@ -4910,6 +4983,9 @@
           </w:p>
         </w:tc>
         <w:tc>
+          <w:tcPr>
+            <w:tcW w:type="dxa" w:w="1560"/>
+          </w:tcPr>
           <w:p>
             <w:pPr>
               <w:pStyle w:val="Compact"/>
@@ -4921,6 +4997,9 @@
           </w:p>
         </w:tc>
         <w:tc>
+          <w:tcPr>
+            <w:tcW w:type="dxa" w:w="1560"/>
+          </w:tcPr>
           <w:p>
             <w:pPr>
               <w:pStyle w:val="Compact"/>
@@ -4934,6 +5013,9 @@
       </w:tr>
       <w:tr>
         <w:tc>
+          <w:tcPr>
+            <w:tcW w:type="dxa" w:w="1560"/>
+          </w:tcPr>
           <w:p>
             <w:pPr>
               <w:pStyle w:val="Compact"/>
@@ -4945,6 +5027,9 @@
           </w:p>
         </w:tc>
         <w:tc>
+          <w:tcPr>
+            <w:tcW w:type="dxa" w:w="1560"/>
+          </w:tcPr>
           <w:p>
             <w:pPr>
               <w:pStyle w:val="Compact"/>
@@ -4956,6 +5041,9 @@
           </w:p>
         </w:tc>
         <w:tc>
+          <w:tcPr>
+            <w:tcW w:type="dxa" w:w="1560"/>
+          </w:tcPr>
           <w:p>
             <w:pPr>
               <w:pStyle w:val="Compact"/>
@@ -4967,6 +5055,9 @@
           </w:p>
         </w:tc>
         <w:tc>
+          <w:tcPr>
+            <w:tcW w:type="dxa" w:w="1560"/>
+          </w:tcPr>
           <w:p>
             <w:pPr>
               <w:pStyle w:val="Compact"/>
@@ -4978,6 +5069,9 @@
           </w:p>
         </w:tc>
         <w:tc>
+          <w:tcPr>
+            <w:tcW w:type="dxa" w:w="1560"/>
+          </w:tcPr>
           <w:p>
             <w:pPr>
               <w:pStyle w:val="Compact"/>
@@ -4989,6 +5083,9 @@
           </w:p>
         </w:tc>
         <w:tc>
+          <w:tcPr>
+            <w:tcW w:type="dxa" w:w="1560"/>
+          </w:tcPr>
           <w:p>
             <w:pPr>
               <w:pStyle w:val="Compact"/>
@@ -5021,8 +5118,9 @@
     <w:tbl>
       <w:tblPr>
         <w:tblStyle w:val="Table"/>
-        <w:tblW w:type="pct" w:w="0.0"/>
+        <w:tblW w:type="dxa" w:w="9360"/>
         <w:tblLook w:firstRow="1"/>
+        <w:tblLayout w:type="fixed"/>
       </w:tblPr>
       <w:tblGrid/>
       <w:tr>
@@ -5031,6 +5129,7 @@
         </w:trPr>
         <w:tc>
           <w:tcPr>
+            <w:tcW w:type="dxa" w:w="3120"/>
             <w:tcBorders>
               <w:bottom w:val="single"/>
             </w:tcBorders>
@@ -5048,6 +5147,7 @@
         </w:tc>
         <w:tc>
           <w:tcPr>
+            <w:tcW w:type="dxa" w:w="3120"/>
             <w:tcBorders>
               <w:bottom w:val="single"/>
             </w:tcBorders>
@@ -5065,6 +5165,7 @@
         </w:tc>
         <w:tc>
           <w:tcPr>
+            <w:tcW w:type="dxa" w:w="3120"/>
             <w:tcBorders>
               <w:bottom w:val="single"/>
             </w:tcBorders>
@@ -5083,6 +5184,9 @@
       </w:tr>
       <w:tr>
         <w:tc>
+          <w:tcPr>
+            <w:tcW w:type="dxa" w:w="3120"/>
+          </w:tcPr>
           <w:p>
             <w:pPr>
               <w:pStyle w:val="Compact"/>
@@ -5094,6 +5198,9 @@
           </w:p>
         </w:tc>
         <w:tc>
+          <w:tcPr>
+            <w:tcW w:type="dxa" w:w="3120"/>
+          </w:tcPr>
           <w:p>
             <w:pPr>
               <w:pStyle w:val="Compact"/>
@@ -5105,6 +5212,9 @@
           </w:p>
         </w:tc>
         <w:tc>
+          <w:tcPr>
+            <w:tcW w:type="dxa" w:w="3120"/>
+          </w:tcPr>
           <w:p>
             <w:pPr>
               <w:pStyle w:val="Compact"/>
@@ -5118,6 +5228,9 @@
       </w:tr>
       <w:tr>
         <w:tc>
+          <w:tcPr>
+            <w:tcW w:type="dxa" w:w="3120"/>
+          </w:tcPr>
           <w:p>
             <w:pPr>
               <w:pStyle w:val="Compact"/>
@@ -5129,6 +5242,9 @@
           </w:p>
         </w:tc>
         <w:tc>
+          <w:tcPr>
+            <w:tcW w:type="dxa" w:w="3120"/>
+          </w:tcPr>
           <w:p>
             <w:pPr>
               <w:pStyle w:val="Compact"/>
@@ -5140,6 +5256,9 @@
           </w:p>
         </w:tc>
         <w:tc>
+          <w:tcPr>
+            <w:tcW w:type="dxa" w:w="3120"/>
+          </w:tcPr>
           <w:p>
             <w:pPr>
               <w:pStyle w:val="Compact"/>
@@ -5153,6 +5272,9 @@
       </w:tr>
       <w:tr>
         <w:tc>
+          <w:tcPr>
+            <w:tcW w:type="dxa" w:w="3120"/>
+          </w:tcPr>
           <w:p>
             <w:pPr>
               <w:pStyle w:val="Compact"/>
@@ -5164,6 +5286,9 @@
           </w:p>
         </w:tc>
         <w:tc>
+          <w:tcPr>
+            <w:tcW w:type="dxa" w:w="3120"/>
+          </w:tcPr>
           <w:p>
             <w:pPr>
               <w:pStyle w:val="Compact"/>
@@ -5175,6 +5300,9 @@
           </w:p>
         </w:tc>
         <w:tc>
+          <w:tcPr>
+            <w:tcW w:type="dxa" w:w="3120"/>
+          </w:tcPr>
           <w:p>
             <w:pPr>
               <w:pStyle w:val="Compact"/>
@@ -5188,6 +5316,9 @@
       </w:tr>
       <w:tr>
         <w:tc>
+          <w:tcPr>
+            <w:tcW w:type="dxa" w:w="3120"/>
+          </w:tcPr>
           <w:p>
             <w:pPr>
               <w:pStyle w:val="Compact"/>
@@ -5199,6 +5330,9 @@
           </w:p>
         </w:tc>
         <w:tc>
+          <w:tcPr>
+            <w:tcW w:type="dxa" w:w="3120"/>
+          </w:tcPr>
           <w:p>
             <w:pPr>
               <w:pStyle w:val="Compact"/>
@@ -5210,6 +5344,9 @@
           </w:p>
         </w:tc>
         <w:tc>
+          <w:tcPr>
+            <w:tcW w:type="dxa" w:w="3120"/>
+          </w:tcPr>
           <w:p>
             <w:pPr>
               <w:pStyle w:val="Compact"/>
@@ -5223,6 +5360,9 @@
       </w:tr>
       <w:tr>
         <w:tc>
+          <w:tcPr>
+            <w:tcW w:type="dxa" w:w="3120"/>
+          </w:tcPr>
           <w:p>
             <w:pPr>
               <w:pStyle w:val="Compact"/>
@@ -5237,6 +5377,9 @@
           </w:p>
         </w:tc>
         <w:tc>
+          <w:tcPr>
+            <w:tcW w:type="dxa" w:w="3120"/>
+          </w:tcPr>
           <w:p>
             <w:pPr>
               <w:pStyle w:val="Compact"/>
@@ -5248,6 +5391,9 @@
           </w:p>
         </w:tc>
         <w:tc>
+          <w:tcPr>
+            <w:tcW w:type="dxa" w:w="3120"/>
+          </w:tcPr>
           <w:p>
             <w:pPr>
               <w:pStyle w:val="Compact"/>
@@ -5277,7 +5423,7 @@
         <w:t xml:space="preserve">results/tep_multiseed_classification.csv</w:t>
       </w:r>
       <w:r>
-        <w:t xml:space="preserve">). Rare-fault recall is seed-sensitive: F3 0.73 ± 0.41, F9 0.79 ± 0.16, F15 0.26 ± 0.24 — documented as a limitation (§5.7).</w:t>
+        <w:t xml:space="preserve">). Rare-fault recall is seed-sensitive: F3 0.73 ± 0.41, F9 0.79 ± 0.16, F15 0.26 ± 0.24 — documented as a limitation (§5.8).</w:t>
       </w:r>
     </w:p>
     <w:p>
@@ -5300,8 +5446,9 @@
     <w:tbl>
       <w:tblPr>
         <w:tblStyle w:val="Table"/>
-        <w:tblW w:type="pct" w:w="0.0"/>
+        <w:tblW w:type="dxa" w:w="9360"/>
         <w:tblLook w:firstRow="1"/>
+        <w:tblLayout w:type="fixed"/>
       </w:tblPr>
       <w:tblGrid/>
       <w:tr>
@@ -5310,6 +5457,7 @@
         </w:trPr>
         <w:tc>
           <w:tcPr>
+            <w:tcW w:type="dxa" w:w="1872"/>
             <w:tcBorders>
               <w:bottom w:val="single"/>
             </w:tcBorders>
@@ -5327,6 +5475,7 @@
         </w:tc>
         <w:tc>
           <w:tcPr>
+            <w:tcW w:type="dxa" w:w="1872"/>
             <w:tcBorders>
               <w:bottom w:val="single"/>
             </w:tcBorders>
@@ -5344,6 +5493,7 @@
         </w:tc>
         <w:tc>
           <w:tcPr>
+            <w:tcW w:type="dxa" w:w="1872"/>
             <w:tcBorders>
               <w:bottom w:val="single"/>
             </w:tcBorders>
@@ -5361,6 +5511,7 @@
         </w:tc>
         <w:tc>
           <w:tcPr>
+            <w:tcW w:type="dxa" w:w="1872"/>
             <w:tcBorders>
               <w:bottom w:val="single"/>
             </w:tcBorders>
@@ -5378,6 +5529,7 @@
         </w:tc>
         <w:tc>
           <w:tcPr>
+            <w:tcW w:type="dxa" w:w="1872"/>
             <w:tcBorders>
               <w:bottom w:val="single"/>
             </w:tcBorders>
@@ -5396,6 +5548,9 @@
       </w:tr>
       <w:tr>
         <w:tc>
+          <w:tcPr>
+            <w:tcW w:type="dxa" w:w="1872"/>
+          </w:tcPr>
           <w:p>
             <w:pPr>
               <w:pStyle w:val="Compact"/>
@@ -5407,6 +5562,9 @@
           </w:p>
         </w:tc>
         <w:tc>
+          <w:tcPr>
+            <w:tcW w:type="dxa" w:w="1872"/>
+          </w:tcPr>
           <w:p>
             <w:pPr>
               <w:pStyle w:val="Compact"/>
@@ -5418,6 +5576,9 @@
           </w:p>
         </w:tc>
         <w:tc>
+          <w:tcPr>
+            <w:tcW w:type="dxa" w:w="1872"/>
+          </w:tcPr>
           <w:p>
             <w:pPr>
               <w:pStyle w:val="Compact"/>
@@ -5429,6 +5590,9 @@
           </w:p>
         </w:tc>
         <w:tc>
+          <w:tcPr>
+            <w:tcW w:type="dxa" w:w="1872"/>
+          </w:tcPr>
           <w:p>
             <w:pPr>
               <w:pStyle w:val="Compact"/>
@@ -5440,6 +5604,9 @@
           </w:p>
         </w:tc>
         <w:tc>
+          <w:tcPr>
+            <w:tcW w:type="dxa" w:w="1872"/>
+          </w:tcPr>
           <w:p>
             <w:pPr>
               <w:pStyle w:val="Compact"/>
@@ -5453,6 +5620,9 @@
       </w:tr>
       <w:tr>
         <w:tc>
+          <w:tcPr>
+            <w:tcW w:type="dxa" w:w="1872"/>
+          </w:tcPr>
           <w:p>
             <w:pPr>
               <w:pStyle w:val="Compact"/>
@@ -5464,6 +5634,9 @@
           </w:p>
         </w:tc>
         <w:tc>
+          <w:tcPr>
+            <w:tcW w:type="dxa" w:w="1872"/>
+          </w:tcPr>
           <w:p>
             <w:pPr>
               <w:pStyle w:val="Compact"/>
@@ -5478,6 +5651,9 @@
           </w:p>
         </w:tc>
         <w:tc>
+          <w:tcPr>
+            <w:tcW w:type="dxa" w:w="1872"/>
+          </w:tcPr>
           <w:p>
             <w:pPr>
               <w:pStyle w:val="Compact"/>
@@ -5489,6 +5665,9 @@
           </w:p>
         </w:tc>
         <w:tc>
+          <w:tcPr>
+            <w:tcW w:type="dxa" w:w="1872"/>
+          </w:tcPr>
           <w:p>
             <w:pPr>
               <w:pStyle w:val="Compact"/>
@@ -5503,6 +5682,9 @@
           </w:p>
         </w:tc>
         <w:tc>
+          <w:tcPr>
+            <w:tcW w:type="dxa" w:w="1872"/>
+          </w:tcPr>
           <w:p>
             <w:pPr>
               <w:pStyle w:val="Compact"/>
@@ -5516,6 +5698,9 @@
       </w:tr>
       <w:tr>
         <w:tc>
+          <w:tcPr>
+            <w:tcW w:type="dxa" w:w="1872"/>
+          </w:tcPr>
           <w:p>
             <w:pPr>
               <w:pStyle w:val="Compact"/>
@@ -5527,6 +5712,9 @@
           </w:p>
         </w:tc>
         <w:tc>
+          <w:tcPr>
+            <w:tcW w:type="dxa" w:w="1872"/>
+          </w:tcPr>
           <w:p>
             <w:pPr>
               <w:pStyle w:val="Compact"/>
@@ -5538,6 +5726,9 @@
           </w:p>
         </w:tc>
         <w:tc>
+          <w:tcPr>
+            <w:tcW w:type="dxa" w:w="1872"/>
+          </w:tcPr>
           <w:p>
             <w:pPr>
               <w:pStyle w:val="Compact"/>
@@ -5549,6 +5740,9 @@
           </w:p>
         </w:tc>
         <w:tc>
+          <w:tcPr>
+            <w:tcW w:type="dxa" w:w="1872"/>
+          </w:tcPr>
           <w:p>
             <w:pPr>
               <w:pStyle w:val="Compact"/>
@@ -5560,6 +5754,9 @@
           </w:p>
         </w:tc>
         <w:tc>
+          <w:tcPr>
+            <w:tcW w:type="dxa" w:w="1872"/>
+          </w:tcPr>
           <w:p>
             <w:pPr>
               <w:pStyle w:val="Compact"/>
@@ -5595,8 +5792,9 @@
     <w:tbl>
       <w:tblPr>
         <w:tblStyle w:val="Table"/>
-        <w:tblW w:type="pct" w:w="0.0"/>
+        <w:tblW w:type="dxa" w:w="9360"/>
         <w:tblLook w:firstRow="1"/>
+        <w:tblLayout w:type="fixed"/>
       </w:tblPr>
       <w:tblGrid/>
       <w:tr>
@@ -5605,6 +5803,7 @@
         </w:trPr>
         <w:tc>
           <w:tcPr>
+            <w:tcW w:type="dxa" w:w="4680"/>
             <w:tcBorders>
               <w:bottom w:val="single"/>
             </w:tcBorders>
@@ -5622,6 +5821,7 @@
         </w:tc>
         <w:tc>
           <w:tcPr>
+            <w:tcW w:type="dxa" w:w="4680"/>
             <w:tcBorders>
               <w:bottom w:val="single"/>
             </w:tcBorders>
@@ -5640,6 +5840,9 @@
       </w:tr>
       <w:tr>
         <w:tc>
+          <w:tcPr>
+            <w:tcW w:type="dxa" w:w="4680"/>
+          </w:tcPr>
           <w:p>
             <w:pPr>
               <w:pStyle w:val="Compact"/>
@@ -5651,6 +5854,9 @@
           </w:p>
         </w:tc>
         <w:tc>
+          <w:tcPr>
+            <w:tcW w:type="dxa" w:w="4680"/>
+          </w:tcPr>
           <w:p>
             <w:pPr>
               <w:pStyle w:val="Compact"/>
@@ -5664,6 +5870,9 @@
       </w:tr>
       <w:tr>
         <w:tc>
+          <w:tcPr>
+            <w:tcW w:type="dxa" w:w="4680"/>
+          </w:tcPr>
           <w:p>
             <w:pPr>
               <w:pStyle w:val="Compact"/>
@@ -5675,6 +5884,9 @@
           </w:p>
         </w:tc>
         <w:tc>
+          <w:tcPr>
+            <w:tcW w:type="dxa" w:w="4680"/>
+          </w:tcPr>
           <w:p>
             <w:pPr>
               <w:pStyle w:val="Compact"/>
@@ -5688,6 +5900,9 @@
       </w:tr>
       <w:tr>
         <w:tc>
+          <w:tcPr>
+            <w:tcW w:type="dxa" w:w="4680"/>
+          </w:tcPr>
           <w:p>
             <w:pPr>
               <w:pStyle w:val="Compact"/>
@@ -5699,6 +5914,9 @@
           </w:p>
         </w:tc>
         <w:tc>
+          <w:tcPr>
+            <w:tcW w:type="dxa" w:w="4680"/>
+          </w:tcPr>
           <w:p>
             <w:pPr>
               <w:pStyle w:val="Compact"/>
@@ -5712,6 +5930,9 @@
       </w:tr>
       <w:tr>
         <w:tc>
+          <w:tcPr>
+            <w:tcW w:type="dxa" w:w="4680"/>
+          </w:tcPr>
           <w:p>
             <w:pPr>
               <w:pStyle w:val="Compact"/>
@@ -5723,6 +5944,9 @@
           </w:p>
         </w:tc>
         <w:tc>
+          <w:tcPr>
+            <w:tcW w:type="dxa" w:w="4680"/>
+          </w:tcPr>
           <w:p>
             <w:pPr>
               <w:pStyle w:val="Compact"/>
@@ -5736,6 +5960,9 @@
       </w:tr>
       <w:tr>
         <w:tc>
+          <w:tcPr>
+            <w:tcW w:type="dxa" w:w="4680"/>
+          </w:tcPr>
           <w:p>
             <w:pPr>
               <w:pStyle w:val="Compact"/>
@@ -5747,6 +5974,9 @@
           </w:p>
         </w:tc>
         <w:tc>
+          <w:tcPr>
+            <w:tcW w:type="dxa" w:w="4680"/>
+          </w:tcPr>
           <w:p>
             <w:pPr>
               <w:pStyle w:val="Compact"/>
@@ -5760,6 +5990,9 @@
       </w:tr>
       <w:tr>
         <w:tc>
+          <w:tcPr>
+            <w:tcW w:type="dxa" w:w="4680"/>
+          </w:tcPr>
           <w:p>
             <w:pPr>
               <w:pStyle w:val="Compact"/>
@@ -5771,6 +6004,9 @@
           </w:p>
         </w:tc>
         <w:tc>
+          <w:tcPr>
+            <w:tcW w:type="dxa" w:w="4680"/>
+          </w:tcPr>
           <w:p>
             <w:pPr>
               <w:pStyle w:val="Compact"/>
@@ -5803,8 +6039,9 @@
     <w:tbl>
       <w:tblPr>
         <w:tblStyle w:val="Table"/>
-        <w:tblW w:type="pct" w:w="0.0"/>
+        <w:tblW w:type="dxa" w:w="9360"/>
         <w:tblLook w:firstRow="1"/>
+        <w:tblLayout w:type="fixed"/>
       </w:tblPr>
       <w:tblGrid/>
       <w:tr>
@@ -5813,6 +6050,7 @@
         </w:trPr>
         <w:tc>
           <w:tcPr>
+            <w:tcW w:type="dxa" w:w="4680"/>
             <w:tcBorders>
               <w:bottom w:val="single"/>
             </w:tcBorders>
@@ -5830,6 +6068,7 @@
         </w:tc>
         <w:tc>
           <w:tcPr>
+            <w:tcW w:type="dxa" w:w="4680"/>
             <w:tcBorders>
               <w:bottom w:val="single"/>
             </w:tcBorders>
@@ -5848,6 +6087,9 @@
       </w:tr>
       <w:tr>
         <w:tc>
+          <w:tcPr>
+            <w:tcW w:type="dxa" w:w="4680"/>
+          </w:tcPr>
           <w:p>
             <w:pPr>
               <w:pStyle w:val="Compact"/>
@@ -5859,6 +6101,9 @@
           </w:p>
         </w:tc>
         <w:tc>
+          <w:tcPr>
+            <w:tcW w:type="dxa" w:w="4680"/>
+          </w:tcPr>
           <w:p>
             <w:pPr>
               <w:pStyle w:val="Compact"/>
@@ -5872,6 +6117,9 @@
       </w:tr>
       <w:tr>
         <w:tc>
+          <w:tcPr>
+            <w:tcW w:type="dxa" w:w="4680"/>
+          </w:tcPr>
           <w:p>
             <w:pPr>
               <w:pStyle w:val="Compact"/>
@@ -5883,6 +6131,9 @@
           </w:p>
         </w:tc>
         <w:tc>
+          <w:tcPr>
+            <w:tcW w:type="dxa" w:w="4680"/>
+          </w:tcPr>
           <w:p>
             <w:pPr>
               <w:pStyle w:val="Compact"/>
@@ -5896,6 +6147,9 @@
       </w:tr>
       <w:tr>
         <w:tc>
+          <w:tcPr>
+            <w:tcW w:type="dxa" w:w="4680"/>
+          </w:tcPr>
           <w:p>
             <w:pPr>
               <w:pStyle w:val="Compact"/>
@@ -5907,6 +6161,9 @@
           </w:p>
         </w:tc>
         <w:tc>
+          <w:tcPr>
+            <w:tcW w:type="dxa" w:w="4680"/>
+          </w:tcPr>
           <w:p>
             <w:pPr>
               <w:pStyle w:val="Compact"/>
@@ -5920,6 +6177,9 @@
       </w:tr>
       <w:tr>
         <w:tc>
+          <w:tcPr>
+            <w:tcW w:type="dxa" w:w="4680"/>
+          </w:tcPr>
           <w:p>
             <w:pPr>
               <w:pStyle w:val="Compact"/>
@@ -5934,6 +6194,9 @@
           </w:p>
         </w:tc>
         <w:tc>
+          <w:tcPr>
+            <w:tcW w:type="dxa" w:w="4680"/>
+          </w:tcPr>
           <w:p>
             <w:pPr>
               <w:pStyle w:val="Compact"/>
@@ -5950,6 +6213,9 @@
       </w:tr>
       <w:tr>
         <w:tc>
+          <w:tcPr>
+            <w:tcW w:type="dxa" w:w="4680"/>
+          </w:tcPr>
           <w:p>
             <w:pPr>
               <w:pStyle w:val="Compact"/>
@@ -5961,6 +6227,9 @@
           </w:p>
         </w:tc>
         <w:tc>
+          <w:tcPr>
+            <w:tcW w:type="dxa" w:w="4680"/>
+          </w:tcPr>
           <w:p>
             <w:pPr>
               <w:pStyle w:val="Compact"/>
@@ -5993,8 +6262,9 @@
     <w:tbl>
       <w:tblPr>
         <w:tblStyle w:val="Table"/>
-        <w:tblW w:type="pct" w:w="0.0"/>
+        <w:tblW w:type="dxa" w:w="9360"/>
         <w:tblLook w:firstRow="1"/>
+        <w:tblLayout w:type="fixed"/>
       </w:tblPr>
       <w:tblGrid/>
       <w:tr>
@@ -6003,6 +6273,7 @@
         </w:trPr>
         <w:tc>
           <w:tcPr>
+            <w:tcW w:type="dxa" w:w="4680"/>
             <w:tcBorders>
               <w:bottom w:val="single"/>
             </w:tcBorders>
@@ -6020,6 +6291,7 @@
         </w:tc>
         <w:tc>
           <w:tcPr>
+            <w:tcW w:type="dxa" w:w="4680"/>
             <w:tcBorders>
               <w:bottom w:val="single"/>
             </w:tcBorders>
@@ -6038,6 +6310,9 @@
       </w:tr>
       <w:tr>
         <w:tc>
+          <w:tcPr>
+            <w:tcW w:type="dxa" w:w="4680"/>
+          </w:tcPr>
           <w:p>
             <w:pPr>
               <w:pStyle w:val="Compact"/>
@@ -6049,6 +6324,9 @@
           </w:p>
         </w:tc>
         <w:tc>
+          <w:tcPr>
+            <w:tcW w:type="dxa" w:w="4680"/>
+          </w:tcPr>
           <w:p>
             <w:pPr>
               <w:pStyle w:val="Compact"/>
@@ -6062,6 +6340,9 @@
       </w:tr>
       <w:tr>
         <w:tc>
+          <w:tcPr>
+            <w:tcW w:type="dxa" w:w="4680"/>
+          </w:tcPr>
           <w:p>
             <w:pPr>
               <w:pStyle w:val="Compact"/>
@@ -6073,6 +6354,9 @@
           </w:p>
         </w:tc>
         <w:tc>
+          <w:tcPr>
+            <w:tcW w:type="dxa" w:w="4680"/>
+          </w:tcPr>
           <w:p>
             <w:pPr>
               <w:pStyle w:val="Compact"/>
@@ -6086,6 +6370,9 @@
       </w:tr>
       <w:tr>
         <w:tc>
+          <w:tcPr>
+            <w:tcW w:type="dxa" w:w="4680"/>
+          </w:tcPr>
           <w:p>
             <w:pPr>
               <w:pStyle w:val="Compact"/>
@@ -6097,6 +6384,9 @@
           </w:p>
         </w:tc>
         <w:tc>
+          <w:tcPr>
+            <w:tcW w:type="dxa" w:w="4680"/>
+          </w:tcPr>
           <w:p>
             <w:pPr>
               <w:pStyle w:val="Compact"/>
@@ -6110,6 +6400,9 @@
       </w:tr>
       <w:tr>
         <w:tc>
+          <w:tcPr>
+            <w:tcW w:type="dxa" w:w="4680"/>
+          </w:tcPr>
           <w:p>
             <w:pPr>
               <w:pStyle w:val="Compact"/>
@@ -6121,6 +6414,9 @@
           </w:p>
         </w:tc>
         <w:tc>
+          <w:tcPr>
+            <w:tcW w:type="dxa" w:w="4680"/>
+          </w:tcPr>
           <w:p>
             <w:pPr>
               <w:pStyle w:val="Compact"/>
@@ -6153,8 +6449,9 @@
     <w:tbl>
       <w:tblPr>
         <w:tblStyle w:val="Table"/>
-        <w:tblW w:type="pct" w:w="0.0"/>
+        <w:tblW w:type="dxa" w:w="9360"/>
         <w:tblLook w:firstRow="1"/>
+        <w:tblLayout w:type="fixed"/>
       </w:tblPr>
       <w:tblGrid/>
       <w:tr>
@@ -6163,6 +6460,7 @@
         </w:trPr>
         <w:tc>
           <w:tcPr>
+            <w:tcW w:type="dxa" w:w="2340"/>
             <w:tcBorders>
               <w:bottom w:val="single"/>
             </w:tcBorders>
@@ -6180,6 +6478,7 @@
         </w:tc>
         <w:tc>
           <w:tcPr>
+            <w:tcW w:type="dxa" w:w="2340"/>
             <w:tcBorders>
               <w:bottom w:val="single"/>
             </w:tcBorders>
@@ -6197,6 +6496,7 @@
         </w:tc>
         <w:tc>
           <w:tcPr>
+            <w:tcW w:type="dxa" w:w="2340"/>
             <w:tcBorders>
               <w:bottom w:val="single"/>
             </w:tcBorders>
@@ -6214,6 +6514,7 @@
         </w:tc>
         <w:tc>
           <w:tcPr>
+            <w:tcW w:type="dxa" w:w="2340"/>
             <w:tcBorders>
               <w:bottom w:val="single"/>
             </w:tcBorders>
@@ -6232,6 +6533,9 @@
       </w:tr>
       <w:tr>
         <w:tc>
+          <w:tcPr>
+            <w:tcW w:type="dxa" w:w="2340"/>
+          </w:tcPr>
           <w:p>
             <w:pPr>
               <w:pStyle w:val="Compact"/>
@@ -6243,6 +6547,9 @@
           </w:p>
         </w:tc>
         <w:tc>
+          <w:tcPr>
+            <w:tcW w:type="dxa" w:w="2340"/>
+          </w:tcPr>
           <w:p>
             <w:pPr>
               <w:pStyle w:val="Compact"/>
@@ -6254,6 +6561,9 @@
           </w:p>
         </w:tc>
         <w:tc>
+          <w:tcPr>
+            <w:tcW w:type="dxa" w:w="2340"/>
+          </w:tcPr>
           <w:p>
             <w:pPr>
               <w:pStyle w:val="Compact"/>
@@ -6265,6 +6575,9 @@
           </w:p>
         </w:tc>
         <w:tc>
+          <w:tcPr>
+            <w:tcW w:type="dxa" w:w="2340"/>
+          </w:tcPr>
           <w:p>
             <w:pPr>
               <w:pStyle w:val="Compact"/>
@@ -6278,6 +6591,9 @@
       </w:tr>
       <w:tr>
         <w:tc>
+          <w:tcPr>
+            <w:tcW w:type="dxa" w:w="2340"/>
+          </w:tcPr>
           <w:p>
             <w:pPr>
               <w:pStyle w:val="Compact"/>
@@ -6289,6 +6605,9 @@
           </w:p>
         </w:tc>
         <w:tc>
+          <w:tcPr>
+            <w:tcW w:type="dxa" w:w="2340"/>
+          </w:tcPr>
           <w:p>
             <w:pPr>
               <w:pStyle w:val="Compact"/>
@@ -6300,6 +6619,9 @@
           </w:p>
         </w:tc>
         <w:tc>
+          <w:tcPr>
+            <w:tcW w:type="dxa" w:w="2340"/>
+          </w:tcPr>
           <w:p>
             <w:pPr>
               <w:pStyle w:val="Compact"/>
@@ -6311,6 +6633,9 @@
           </w:p>
         </w:tc>
         <w:tc>
+          <w:tcPr>
+            <w:tcW w:type="dxa" w:w="2340"/>
+          </w:tcPr>
           <w:p>
             <w:pPr>
               <w:pStyle w:val="Compact"/>
@@ -6324,6 +6649,9 @@
       </w:tr>
       <w:tr>
         <w:tc>
+          <w:tcPr>
+            <w:tcW w:type="dxa" w:w="2340"/>
+          </w:tcPr>
           <w:p>
             <w:pPr>
               <w:pStyle w:val="Compact"/>
@@ -6335,6 +6663,9 @@
           </w:p>
         </w:tc>
         <w:tc>
+          <w:tcPr>
+            <w:tcW w:type="dxa" w:w="2340"/>
+          </w:tcPr>
           <w:p>
             <w:pPr>
               <w:pStyle w:val="Compact"/>
@@ -6346,6 +6677,9 @@
           </w:p>
         </w:tc>
         <w:tc>
+          <w:tcPr>
+            <w:tcW w:type="dxa" w:w="2340"/>
+          </w:tcPr>
           <w:p>
             <w:pPr>
               <w:pStyle w:val="Compact"/>
@@ -6357,6 +6691,9 @@
           </w:p>
         </w:tc>
         <w:tc>
+          <w:tcPr>
+            <w:tcW w:type="dxa" w:w="2340"/>
+          </w:tcPr>
           <w:p>
             <w:pPr>
               <w:pStyle w:val="Compact"/>
@@ -6370,6 +6707,9 @@
       </w:tr>
       <w:tr>
         <w:tc>
+          <w:tcPr>
+            <w:tcW w:type="dxa" w:w="2340"/>
+          </w:tcPr>
           <w:p>
             <w:pPr>
               <w:pStyle w:val="Compact"/>
@@ -6381,6 +6721,9 @@
           </w:p>
         </w:tc>
         <w:tc>
+          <w:tcPr>
+            <w:tcW w:type="dxa" w:w="2340"/>
+          </w:tcPr>
           <w:p>
             <w:pPr>
               <w:pStyle w:val="Compact"/>
@@ -6392,6 +6735,9 @@
           </w:p>
         </w:tc>
         <w:tc>
+          <w:tcPr>
+            <w:tcW w:type="dxa" w:w="2340"/>
+          </w:tcPr>
           <w:p>
             <w:pPr>
               <w:pStyle w:val="Compact"/>
@@ -6403,6 +6749,9 @@
           </w:p>
         </w:tc>
         <w:tc>
+          <w:tcPr>
+            <w:tcW w:type="dxa" w:w="2340"/>
+          </w:tcPr>
           <w:p>
             <w:pPr>
               <w:pStyle w:val="Compact"/>
@@ -6416,6 +6765,9 @@
       </w:tr>
       <w:tr>
         <w:tc>
+          <w:tcPr>
+            <w:tcW w:type="dxa" w:w="2340"/>
+          </w:tcPr>
           <w:p>
             <w:pPr>
               <w:pStyle w:val="Compact"/>
@@ -6427,6 +6779,9 @@
           </w:p>
         </w:tc>
         <w:tc>
+          <w:tcPr>
+            <w:tcW w:type="dxa" w:w="2340"/>
+          </w:tcPr>
           <w:p>
             <w:pPr>
               <w:pStyle w:val="Compact"/>
@@ -6438,6 +6793,9 @@
           </w:p>
         </w:tc>
         <w:tc>
+          <w:tcPr>
+            <w:tcW w:type="dxa" w:w="2340"/>
+          </w:tcPr>
           <w:p>
             <w:pPr>
               <w:pStyle w:val="Compact"/>
@@ -6449,6 +6807,9 @@
           </w:p>
         </w:tc>
         <w:tc>
+          <w:tcPr>
+            <w:tcW w:type="dxa" w:w="2340"/>
+          </w:tcPr>
           <w:p>
             <w:pPr>
               <w:pStyle w:val="Compact"/>
@@ -6481,8 +6842,9 @@
     <w:tbl>
       <w:tblPr>
         <w:tblStyle w:val="Table"/>
-        <w:tblW w:type="pct" w:w="0.0"/>
+        <w:tblW w:type="dxa" w:w="9360"/>
         <w:tblLook w:firstRow="1"/>
+        <w:tblLayout w:type="fixed"/>
       </w:tblPr>
       <w:tblGrid/>
       <w:tr>
@@ -6491,6 +6853,7 @@
         </w:trPr>
         <w:tc>
           <w:tcPr>
+            <w:tcW w:type="dxa" w:w="3120"/>
             <w:tcBorders>
               <w:bottom w:val="single"/>
             </w:tcBorders>
@@ -6508,6 +6871,7 @@
         </w:tc>
         <w:tc>
           <w:tcPr>
+            <w:tcW w:type="dxa" w:w="3120"/>
             <w:tcBorders>
               <w:bottom w:val="single"/>
             </w:tcBorders>
@@ -6525,6 +6889,7 @@
         </w:tc>
         <w:tc>
           <w:tcPr>
+            <w:tcW w:type="dxa" w:w="3120"/>
             <w:tcBorders>
               <w:bottom w:val="single"/>
             </w:tcBorders>
@@ -6543,6 +6908,9 @@
       </w:tr>
       <w:tr>
         <w:tc>
+          <w:tcPr>
+            <w:tcW w:type="dxa" w:w="3120"/>
+          </w:tcPr>
           <w:p>
             <w:pPr>
               <w:pStyle w:val="Compact"/>
@@ -6554,6 +6922,9 @@
           </w:p>
         </w:tc>
         <w:tc>
+          <w:tcPr>
+            <w:tcW w:type="dxa" w:w="3120"/>
+          </w:tcPr>
           <w:p>
             <w:pPr>
               <w:pStyle w:val="Compact"/>
@@ -6565,6 +6936,9 @@
           </w:p>
         </w:tc>
         <w:tc>
+          <w:tcPr>
+            <w:tcW w:type="dxa" w:w="3120"/>
+          </w:tcPr>
           <w:p>
             <w:pPr>
               <w:pStyle w:val="Compact"/>
@@ -6578,6 +6952,9 @@
       </w:tr>
       <w:tr>
         <w:tc>
+          <w:tcPr>
+            <w:tcW w:type="dxa" w:w="3120"/>
+          </w:tcPr>
           <w:p>
             <w:pPr>
               <w:pStyle w:val="Compact"/>
@@ -6589,6 +6966,9 @@
           </w:p>
         </w:tc>
         <w:tc>
+          <w:tcPr>
+            <w:tcW w:type="dxa" w:w="3120"/>
+          </w:tcPr>
           <w:p>
             <w:pPr>
               <w:pStyle w:val="Compact"/>
@@ -6600,6 +6980,9 @@
           </w:p>
         </w:tc>
         <w:tc>
+          <w:tcPr>
+            <w:tcW w:type="dxa" w:w="3120"/>
+          </w:tcPr>
           <w:p>
             <w:pPr>
               <w:pStyle w:val="Compact"/>
@@ -6613,6 +6996,9 @@
       </w:tr>
       <w:tr>
         <w:tc>
+          <w:tcPr>
+            <w:tcW w:type="dxa" w:w="3120"/>
+          </w:tcPr>
           <w:p>
             <w:pPr>
               <w:pStyle w:val="Compact"/>
@@ -6624,6 +7010,9 @@
           </w:p>
         </w:tc>
         <w:tc>
+          <w:tcPr>
+            <w:tcW w:type="dxa" w:w="3120"/>
+          </w:tcPr>
           <w:p>
             <w:pPr>
               <w:pStyle w:val="Compact"/>
@@ -6635,6 +7024,9 @@
           </w:p>
         </w:tc>
         <w:tc>
+          <w:tcPr>
+            <w:tcW w:type="dxa" w:w="3120"/>
+          </w:tcPr>
           <w:p>
             <w:pPr>
               <w:pStyle w:val="Compact"/>
@@ -6648,6 +7040,9 @@
       </w:tr>
       <w:tr>
         <w:tc>
+          <w:tcPr>
+            <w:tcW w:type="dxa" w:w="3120"/>
+          </w:tcPr>
           <w:p>
             <w:pPr>
               <w:pStyle w:val="Compact"/>
@@ -6659,6 +7054,9 @@
           </w:p>
         </w:tc>
         <w:tc>
+          <w:tcPr>
+            <w:tcW w:type="dxa" w:w="3120"/>
+          </w:tcPr>
           <w:p>
             <w:pPr>
               <w:pStyle w:val="Compact"/>
@@ -6670,6 +7068,9 @@
           </w:p>
         </w:tc>
         <w:tc>
+          <w:tcPr>
+            <w:tcW w:type="dxa" w:w="3120"/>
+          </w:tcPr>
           <w:p>
             <w:pPr>
               <w:pStyle w:val="Compact"/>
@@ -6683,6 +7084,9 @@
       </w:tr>
       <w:tr>
         <w:tc>
+          <w:tcPr>
+            <w:tcW w:type="dxa" w:w="3120"/>
+          </w:tcPr>
           <w:p>
             <w:pPr>
               <w:pStyle w:val="Compact"/>
@@ -6694,6 +7098,9 @@
           </w:p>
         </w:tc>
         <w:tc>
+          <w:tcPr>
+            <w:tcW w:type="dxa" w:w="3120"/>
+          </w:tcPr>
           <w:p>
             <w:pPr>
               <w:pStyle w:val="Compact"/>
@@ -6705,6 +7112,9 @@
           </w:p>
         </w:tc>
         <w:tc>
+          <w:tcPr>
+            <w:tcW w:type="dxa" w:w="3120"/>
+          </w:tcPr>
           <w:p>
             <w:pPr>
               <w:pStyle w:val="Compact"/>
@@ -6737,8 +7147,9 @@
     <w:tbl>
       <w:tblPr>
         <w:tblStyle w:val="Table"/>
-        <w:tblW w:type="pct" w:w="0.0"/>
+        <w:tblW w:type="dxa" w:w="9360"/>
         <w:tblLook w:firstRow="1"/>
+        <w:tblLayout w:type="fixed"/>
       </w:tblPr>
       <w:tblGrid/>
       <w:tr>
@@ -6747,6 +7158,7 @@
         </w:trPr>
         <w:tc>
           <w:tcPr>
+            <w:tcW w:type="dxa" w:w="1872"/>
             <w:tcBorders>
               <w:bottom w:val="single"/>
             </w:tcBorders>
@@ -6764,6 +7176,7 @@
         </w:tc>
         <w:tc>
           <w:tcPr>
+            <w:tcW w:type="dxa" w:w="1872"/>
             <w:tcBorders>
               <w:bottom w:val="single"/>
             </w:tcBorders>
@@ -6781,6 +7194,7 @@
         </w:tc>
         <w:tc>
           <w:tcPr>
+            <w:tcW w:type="dxa" w:w="1872"/>
             <w:tcBorders>
               <w:bottom w:val="single"/>
             </w:tcBorders>
@@ -6798,6 +7212,7 @@
         </w:tc>
         <w:tc>
           <w:tcPr>
+            <w:tcW w:type="dxa" w:w="1872"/>
             <w:tcBorders>
               <w:bottom w:val="single"/>
             </w:tcBorders>
@@ -6815,6 +7230,7 @@
         </w:tc>
         <w:tc>
           <w:tcPr>
+            <w:tcW w:type="dxa" w:w="1872"/>
             <w:tcBorders>
               <w:bottom w:val="single"/>
             </w:tcBorders>
@@ -6833,6 +7249,9 @@
       </w:tr>
       <w:tr>
         <w:tc>
+          <w:tcPr>
+            <w:tcW w:type="dxa" w:w="1872"/>
+          </w:tcPr>
           <w:p>
             <w:pPr>
               <w:pStyle w:val="Compact"/>
@@ -6844,6 +7263,9 @@
           </w:p>
         </w:tc>
         <w:tc>
+          <w:tcPr>
+            <w:tcW w:type="dxa" w:w="1872"/>
+          </w:tcPr>
           <w:p>
             <w:pPr>
               <w:pStyle w:val="Compact"/>
@@ -6855,6 +7277,9 @@
           </w:p>
         </w:tc>
         <w:tc>
+          <w:tcPr>
+            <w:tcW w:type="dxa" w:w="1872"/>
+          </w:tcPr>
           <w:p>
             <w:pPr>
               <w:pStyle w:val="Compact"/>
@@ -6866,6 +7291,9 @@
           </w:p>
         </w:tc>
         <w:tc>
+          <w:tcPr>
+            <w:tcW w:type="dxa" w:w="1872"/>
+          </w:tcPr>
           <w:p>
             <w:pPr>
               <w:pStyle w:val="Compact"/>
@@ -6877,6 +7305,9 @@
           </w:p>
         </w:tc>
         <w:tc>
+          <w:tcPr>
+            <w:tcW w:type="dxa" w:w="1872"/>
+          </w:tcPr>
           <w:p>
             <w:pPr>
               <w:pStyle w:val="Compact"/>
@@ -6890,6 +7321,9 @@
       </w:tr>
       <w:tr>
         <w:tc>
+          <w:tcPr>
+            <w:tcW w:type="dxa" w:w="1872"/>
+          </w:tcPr>
           <w:p>
             <w:pPr>
               <w:pStyle w:val="Compact"/>
@@ -6901,6 +7335,9 @@
           </w:p>
         </w:tc>
         <w:tc>
+          <w:tcPr>
+            <w:tcW w:type="dxa" w:w="1872"/>
+          </w:tcPr>
           <w:p>
             <w:pPr>
               <w:pStyle w:val="Compact"/>
@@ -6912,6 +7349,9 @@
           </w:p>
         </w:tc>
         <w:tc>
+          <w:tcPr>
+            <w:tcW w:type="dxa" w:w="1872"/>
+          </w:tcPr>
           <w:p>
             <w:pPr>
               <w:pStyle w:val="Compact"/>
@@ -6923,6 +7363,9 @@
           </w:p>
         </w:tc>
         <w:tc>
+          <w:tcPr>
+            <w:tcW w:type="dxa" w:w="1872"/>
+          </w:tcPr>
           <w:p>
             <w:pPr>
               <w:pStyle w:val="Compact"/>
@@ -6934,6 +7377,9 @@
           </w:p>
         </w:tc>
         <w:tc>
+          <w:tcPr>
+            <w:tcW w:type="dxa" w:w="1872"/>
+          </w:tcPr>
           <w:p>
             <w:pPr>
               <w:pStyle w:val="Compact"/>
@@ -6947,6 +7393,9 @@
       </w:tr>
       <w:tr>
         <w:tc>
+          <w:tcPr>
+            <w:tcW w:type="dxa" w:w="1872"/>
+          </w:tcPr>
           <w:p>
             <w:pPr>
               <w:pStyle w:val="Compact"/>
@@ -6958,6 +7407,9 @@
           </w:p>
         </w:tc>
         <w:tc>
+          <w:tcPr>
+            <w:tcW w:type="dxa" w:w="1872"/>
+          </w:tcPr>
           <w:p>
             <w:pPr>
               <w:pStyle w:val="Compact"/>
@@ -6969,6 +7421,9 @@
           </w:p>
         </w:tc>
         <w:tc>
+          <w:tcPr>
+            <w:tcW w:type="dxa" w:w="1872"/>
+          </w:tcPr>
           <w:p>
             <w:pPr>
               <w:pStyle w:val="Compact"/>
@@ -6980,6 +7435,9 @@
           </w:p>
         </w:tc>
         <w:tc>
+          <w:tcPr>
+            <w:tcW w:type="dxa" w:w="1872"/>
+          </w:tcPr>
           <w:p>
             <w:pPr>
               <w:pStyle w:val="Compact"/>
@@ -6991,6 +7449,9 @@
           </w:p>
         </w:tc>
         <w:tc>
+          <w:tcPr>
+            <w:tcW w:type="dxa" w:w="1872"/>
+          </w:tcPr>
           <w:p>
             <w:pPr>
               <w:pStyle w:val="Compact"/>
@@ -7004,6 +7465,9 @@
       </w:tr>
       <w:tr>
         <w:tc>
+          <w:tcPr>
+            <w:tcW w:type="dxa" w:w="1872"/>
+          </w:tcPr>
           <w:p>
             <w:pPr>
               <w:pStyle w:val="Compact"/>
@@ -7015,6 +7479,9 @@
           </w:p>
         </w:tc>
         <w:tc>
+          <w:tcPr>
+            <w:tcW w:type="dxa" w:w="1872"/>
+          </w:tcPr>
           <w:p>
             <w:pPr>
               <w:pStyle w:val="Compact"/>
@@ -7026,6 +7493,9 @@
           </w:p>
         </w:tc>
         <w:tc>
+          <w:tcPr>
+            <w:tcW w:type="dxa" w:w="1872"/>
+          </w:tcPr>
           <w:p>
             <w:pPr>
               <w:pStyle w:val="Compact"/>
@@ -7037,6 +7507,9 @@
           </w:p>
         </w:tc>
         <w:tc>
+          <w:tcPr>
+            <w:tcW w:type="dxa" w:w="1872"/>
+          </w:tcPr>
           <w:p>
             <w:pPr>
               <w:pStyle w:val="Compact"/>
@@ -7048,6 +7521,9 @@
           </w:p>
         </w:tc>
         <w:tc>
+          <w:tcPr>
+            <w:tcW w:type="dxa" w:w="1872"/>
+          </w:tcPr>
           <w:p>
             <w:pPr>
               <w:pStyle w:val="Compact"/>
@@ -7061,6 +7537,9 @@
       </w:tr>
       <w:tr>
         <w:tc>
+          <w:tcPr>
+            <w:tcW w:type="dxa" w:w="1872"/>
+          </w:tcPr>
           <w:p>
             <w:pPr>
               <w:pStyle w:val="Compact"/>
@@ -7072,6 +7551,9 @@
           </w:p>
         </w:tc>
         <w:tc>
+          <w:tcPr>
+            <w:tcW w:type="dxa" w:w="1872"/>
+          </w:tcPr>
           <w:p>
             <w:pPr>
               <w:pStyle w:val="Compact"/>
@@ -7083,6 +7565,9 @@
           </w:p>
         </w:tc>
         <w:tc>
+          <w:tcPr>
+            <w:tcW w:type="dxa" w:w="1872"/>
+          </w:tcPr>
           <w:p>
             <w:pPr>
               <w:pStyle w:val="Compact"/>
@@ -7094,6 +7579,9 @@
           </w:p>
         </w:tc>
         <w:tc>
+          <w:tcPr>
+            <w:tcW w:type="dxa" w:w="1872"/>
+          </w:tcPr>
           <w:p>
             <w:pPr>
               <w:pStyle w:val="Compact"/>
@@ -7105,6 +7593,9 @@
           </w:p>
         </w:tc>
         <w:tc>
+          <w:tcPr>
+            <w:tcW w:type="dxa" w:w="1872"/>
+          </w:tcPr>
           <w:p>
             <w:pPr>
               <w:pStyle w:val="Compact"/>
@@ -7118,6 +7609,9 @@
       </w:tr>
       <w:tr>
         <w:tc>
+          <w:tcPr>
+            <w:tcW w:type="dxa" w:w="1872"/>
+          </w:tcPr>
           <w:p>
             <w:pPr>
               <w:pStyle w:val="Compact"/>
@@ -7132,6 +7626,9 @@
           </w:p>
         </w:tc>
         <w:tc>
+          <w:tcPr>
+            <w:tcW w:type="dxa" w:w="1872"/>
+          </w:tcPr>
           <w:p>
             <w:pPr>
               <w:pStyle w:val="Compact"/>
@@ -7143,6 +7640,9 @@
           </w:p>
         </w:tc>
         <w:tc>
+          <w:tcPr>
+            <w:tcW w:type="dxa" w:w="1872"/>
+          </w:tcPr>
           <w:p>
             <w:pPr>
               <w:pStyle w:val="Compact"/>
@@ -7154,6 +7654,9 @@
           </w:p>
         </w:tc>
         <w:tc>
+          <w:tcPr>
+            <w:tcW w:type="dxa" w:w="1872"/>
+          </w:tcPr>
           <w:p>
             <w:pPr>
               <w:pStyle w:val="Compact"/>
@@ -7165,6 +7668,9 @@
           </w:p>
         </w:tc>
         <w:tc>
+          <w:tcPr>
+            <w:tcW w:type="dxa" w:w="1872"/>
+          </w:tcPr>
           <w:p>
             <w:pPr>
               <w:pStyle w:val="Compact"/>
@@ -7178,6 +7684,9 @@
       </w:tr>
       <w:tr>
         <w:tc>
+          <w:tcPr>
+            <w:tcW w:type="dxa" w:w="1872"/>
+          </w:tcPr>
           <w:p>
             <w:pPr>
               <w:pStyle w:val="Compact"/>
@@ -7192,6 +7701,9 @@
           </w:p>
         </w:tc>
         <w:tc>
+          <w:tcPr>
+            <w:tcW w:type="dxa" w:w="1872"/>
+          </w:tcPr>
           <w:p>
             <w:pPr>
               <w:pStyle w:val="Compact"/>
@@ -7203,6 +7715,9 @@
           </w:p>
         </w:tc>
         <w:tc>
+          <w:tcPr>
+            <w:tcW w:type="dxa" w:w="1872"/>
+          </w:tcPr>
           <w:p>
             <w:pPr>
               <w:pStyle w:val="Compact"/>
@@ -7214,6 +7729,9 @@
           </w:p>
         </w:tc>
         <w:tc>
+          <w:tcPr>
+            <w:tcW w:type="dxa" w:w="1872"/>
+          </w:tcPr>
           <w:p>
             <w:pPr>
               <w:pStyle w:val="Compact"/>
@@ -7225,6 +7743,9 @@
           </w:p>
         </w:tc>
         <w:tc>
+          <w:tcPr>
+            <w:tcW w:type="dxa" w:w="1872"/>
+          </w:tcPr>
           <w:p>
             <w:pPr>
               <w:pStyle w:val="Compact"/>
@@ -7238,6 +7759,9 @@
       </w:tr>
       <w:tr>
         <w:tc>
+          <w:tcPr>
+            <w:tcW w:type="dxa" w:w="1872"/>
+          </w:tcPr>
           <w:p>
             <w:pPr>
               <w:pStyle w:val="Compact"/>
@@ -7252,6 +7776,9 @@
           </w:p>
         </w:tc>
         <w:tc>
+          <w:tcPr>
+            <w:tcW w:type="dxa" w:w="1872"/>
+          </w:tcPr>
           <w:p>
             <w:pPr>
               <w:pStyle w:val="Compact"/>
@@ -7263,6 +7790,9 @@
           </w:p>
         </w:tc>
         <w:tc>
+          <w:tcPr>
+            <w:tcW w:type="dxa" w:w="1872"/>
+          </w:tcPr>
           <w:p>
             <w:pPr>
               <w:pStyle w:val="Compact"/>
@@ -7274,6 +7804,9 @@
           </w:p>
         </w:tc>
         <w:tc>
+          <w:tcPr>
+            <w:tcW w:type="dxa" w:w="1872"/>
+          </w:tcPr>
           <w:p>
             <w:pPr>
               <w:pStyle w:val="Compact"/>
@@ -7285,6 +7818,9 @@
           </w:p>
         </w:tc>
         <w:tc>
+          <w:tcPr>
+            <w:tcW w:type="dxa" w:w="1872"/>
+          </w:tcPr>
           <w:p>
             <w:pPr>
               <w:pStyle w:val="Compact"/>

</xml_diff>